<commit_message>
feat: add returns management process document
</commit_message>
<xml_diff>
--- a/01.WORKING_SPACE/hau/quytrinhquanlitrahang.docx
+++ b/01.WORKING_SPACE/hau/quytrinhquanlitrahang.docx
@@ -151,25 +151,7 @@
           <w:sz w:val="26"/>
           <w:szCs w:val="26"/>
         </w:rPr>
-        <w:t xml:space="preserve">Sau khi nhận được yêu cầu, bộ phận Chăm sóc khách hàng tiến hành tiếp nhận và kiểm tra các thông tin </w:t>
-      </w:r>
-      <w:proofErr w:type="gramStart"/>
-      <w:r>
-        <w:rPr>
-          <w:rFonts w:ascii="Times New Roman" w:hAnsi="Times New Roman" w:cs="Times New Roman"/>
-          <w:sz w:val="26"/>
-          <w:szCs w:val="26"/>
-        </w:rPr>
-        <w:t>do</w:t>
-      </w:r>
-      <w:proofErr w:type="gramEnd"/>
-      <w:r>
-        <w:rPr>
-          <w:rFonts w:ascii="Times New Roman" w:hAnsi="Times New Roman" w:cs="Times New Roman"/>
-          <w:sz w:val="26"/>
-          <w:szCs w:val="26"/>
-        </w:rPr>
-        <w:t xml:space="preserve"> khách hàng cung cấp. Các nội dung được kiểm tra bao gồm mã vận đơn, thông tin người gửi, người nhận, trạng thái đơn hàng và nội dung yêu cầu.</w:t>
+        <w:t>Sau khi nhận được yêu cầu, bộ phận Chăm sóc khách hàng tiến hành tiếp nhận và kiểm tra các thông tin do khách hàng cung cấp. Các nội dung được kiểm tra bao gồm mã vận đơn, thông tin người gửi, người nhận, trạng thái đơn hàng và nội dung yêu cầu.</w:t>
       </w:r>
     </w:p>
     <w:p>
@@ -429,10 +411,10 @@
           <w:szCs w:val="26"/>
         </w:rPr>
         <w:drawing>
-          <wp:inline distT="0" distB="0" distL="0" distR="0" wp14:anchorId="023EE193" wp14:editId="0AFEABDA">
-            <wp:extent cx="5943600" cy="3962400"/>
+          <wp:inline distT="0" distB="0" distL="0" distR="0" wp14:anchorId="7DB66143" wp14:editId="08A1AE08">
+            <wp:extent cx="5943600" cy="3166745"/>
             <wp:effectExtent l="0" t="0" r="0" b="0"/>
-            <wp:docPr id="664063191" name="Picture 1"/>
+            <wp:docPr id="1165583722" name="Picture 1"/>
             <wp:cNvGraphicFramePr>
               <a:graphicFrameLocks xmlns:a="http://schemas.openxmlformats.org/drawingml/2006/main" noChangeAspect="1"/>
             </wp:cNvGraphicFramePr>
@@ -440,7 +422,7 @@
               <a:graphicData uri="http://schemas.openxmlformats.org/drawingml/2006/picture">
                 <pic:pic xmlns:pic="http://schemas.openxmlformats.org/drawingml/2006/picture">
                   <pic:nvPicPr>
-                    <pic:cNvPr id="664063191" name=""/>
+                    <pic:cNvPr id="1165583722" name=""/>
                     <pic:cNvPicPr/>
                   </pic:nvPicPr>
                   <pic:blipFill>
@@ -452,7 +434,7 @@
                   <pic:spPr>
                     <a:xfrm>
                       <a:off x="0" y="0"/>
-                      <a:ext cx="5943600" cy="3962400"/>
+                      <a:ext cx="5943600" cy="3166745"/>
                     </a:xfrm>
                     <a:prstGeom prst="rect">
                       <a:avLst/>
@@ -483,7 +465,6 @@
           <w:sz w:val="26"/>
           <w:szCs w:val="26"/>
         </w:rPr>
-        <w:lastRenderedPageBreak/>
         <w:t>3.8.2 Phân tích quy trình</w:t>
       </w:r>
     </w:p>
@@ -528,6 +509,7 @@
           <w:sz w:val="26"/>
           <w:szCs w:val="26"/>
         </w:rPr>
+        <w:lastRenderedPageBreak/>
         <w:t>Khách hàng:</w:t>
       </w:r>
       <w:r>
@@ -911,7 +893,6 @@
           <w:sz w:val="26"/>
           <w:szCs w:val="26"/>
         </w:rPr>
-        <w:lastRenderedPageBreak/>
         <w:t>3.8.2.4. Những kết quả có thể đạt được</w:t>
       </w:r>
     </w:p>
@@ -954,6 +935,7 @@
           <w:sz w:val="26"/>
           <w:szCs w:val="26"/>
         </w:rPr>
+        <w:lastRenderedPageBreak/>
         <w:t xml:space="preserve">Khiếu nại của khách hàng được xác minh và giải quyết theo đúng quy định. </w:t>
       </w:r>
     </w:p>
@@ -1942,7 +1924,6 @@
               <w:rPr>
                 <w:rFonts w:ascii="Times New Roman" w:hAnsi="Times New Roman" w:cs="Times New Roman"/>
               </w:rPr>
-              <w:lastRenderedPageBreak/>
               <w:t>10b. Lập biên bản, báo cáo CSKH</w:t>
             </w:r>
           </w:p>
@@ -2017,6 +1998,7 @@
               <w:rPr>
                 <w:rFonts w:ascii="Times New Roman" w:hAnsi="Times New Roman" w:cs="Times New Roman"/>
               </w:rPr>
+              <w:lastRenderedPageBreak/>
               <w:t>11. Xử lý hoàn trả hàng cho người gửi</w:t>
             </w:r>
           </w:p>
@@ -2224,20 +2206,6 @@
           <w:szCs w:val="26"/>
         </w:rPr>
       </w:pPr>
-    </w:p>
-    <w:p>
-      <w:pPr>
-        <w:jc w:val="center"/>
-        <w:rPr>
-          <w:rFonts w:ascii="Times New Roman" w:hAnsi="Times New Roman" w:cs="Times New Roman"/>
-        </w:rPr>
-      </w:pPr>
-      <w:r>
-        <w:rPr>
-          <w:rFonts w:ascii="Times New Roman" w:hAnsi="Times New Roman" w:cs="Times New Roman"/>
-        </w:rPr>
-        <w:t>Bảng 3.x. Phân tích giá trị gia tăng quy trình Quản lý hoàn trả hàng và Chăm sóc khách hàng</w:t>
-      </w:r>
     </w:p>
     <w:p>
       <w:pPr>
@@ -2636,24 +2604,6 @@
     </w:p>
     <w:p>
       <w:pPr>
-        <w:jc w:val="center"/>
-        <w:rPr>
-          <w:rFonts w:ascii="Times New Roman" w:hAnsi="Times New Roman" w:cs="Times New Roman"/>
-          <w:sz w:val="26"/>
-          <w:szCs w:val="26"/>
-        </w:rPr>
-      </w:pPr>
-      <w:r>
-        <w:rPr>
-          <w:rFonts w:ascii="Times New Roman" w:hAnsi="Times New Roman" w:cs="Times New Roman"/>
-          <w:sz w:val="26"/>
-          <w:szCs w:val="26"/>
-        </w:rPr>
-        <w:t>Bảng 3.x. Phân tích lãng phí quy trình Quản lý hoàn trả hàng và Chăm sóc khách hàng</w:t>
-      </w:r>
-    </w:p>
-    <w:p>
-      <w:pPr>
         <w:rPr>
           <w:rFonts w:ascii="Times New Roman" w:hAnsi="Times New Roman" w:cs="Times New Roman"/>
           <w:b/>
@@ -3236,7 +3186,6 @@
               <w:rPr>
                 <w:rFonts w:ascii="Times New Roman" w:hAnsi="Times New Roman" w:cs="Times New Roman"/>
               </w:rPr>
-              <w:lastRenderedPageBreak/>
               <w:t>5</w:t>
             </w:r>
           </w:p>
@@ -3801,6 +3750,7 @@
               <w:rPr>
                 <w:rFonts w:ascii="Times New Roman" w:hAnsi="Times New Roman" w:cs="Times New Roman"/>
               </w:rPr>
+              <w:lastRenderedPageBreak/>
               <w:t>11</w:t>
             </w:r>
           </w:p>
@@ -4160,21 +4110,14 @@
     </w:tbl>
     <w:p>
       <w:pPr>
-        <w:jc w:val="center"/>
-        <w:rPr>
-          <w:rFonts w:ascii="Times New Roman" w:hAnsi="Times New Roman" w:cs="Times New Roman"/>
-          <w:sz w:val="26"/>
-          <w:szCs w:val="26"/>
-        </w:rPr>
-      </w:pPr>
-      <w:r>
-        <w:rPr>
-          <w:rFonts w:ascii="Times New Roman" w:hAnsi="Times New Roman" w:cs="Times New Roman"/>
-          <w:sz w:val="26"/>
-          <w:szCs w:val="26"/>
-        </w:rPr>
-        <w:t>Bảng 3.x. Thời gian xử lý trung bình của từng hoạt động</w:t>
-      </w:r>
+        <w:rPr>
+          <w:rFonts w:ascii="Times New Roman" w:hAnsi="Times New Roman" w:cs="Times New Roman"/>
+          <w:b/>
+          <w:bCs/>
+          <w:sz w:val="26"/>
+          <w:szCs w:val="26"/>
+        </w:rPr>
+      </w:pPr>
     </w:p>
     <w:p>
       <w:pPr>
@@ -4717,21 +4660,14 @@
     </w:tbl>
     <w:p>
       <w:pPr>
-        <w:jc w:val="center"/>
-        <w:rPr>
-          <w:rFonts w:ascii="Times New Roman" w:hAnsi="Times New Roman" w:cs="Times New Roman"/>
-          <w:sz w:val="26"/>
-          <w:szCs w:val="26"/>
-        </w:rPr>
-      </w:pPr>
-      <w:r>
-        <w:rPr>
-          <w:rFonts w:ascii="Times New Roman" w:hAnsi="Times New Roman" w:cs="Times New Roman"/>
-          <w:sz w:val="26"/>
-          <w:szCs w:val="26"/>
-        </w:rPr>
-        <w:t>Bảng 3.x. Tổng hợp thời gian theo bộ phận</w:t>
-      </w:r>
+        <w:rPr>
+          <w:rFonts w:ascii="Times New Roman" w:hAnsi="Times New Roman" w:cs="Times New Roman"/>
+          <w:b/>
+          <w:bCs/>
+          <w:sz w:val="26"/>
+          <w:szCs w:val="26"/>
+        </w:rPr>
+      </w:pPr>
     </w:p>
     <w:p>
       <w:pPr>
@@ -5217,21 +5153,14 @@
     </w:tbl>
     <w:p>
       <w:pPr>
-        <w:jc w:val="center"/>
-        <w:rPr>
-          <w:rFonts w:ascii="Times New Roman" w:hAnsi="Times New Roman" w:cs="Times New Roman"/>
-          <w:sz w:val="26"/>
-          <w:szCs w:val="26"/>
-        </w:rPr>
-      </w:pPr>
-      <w:r>
-        <w:rPr>
-          <w:rFonts w:ascii="Times New Roman" w:hAnsi="Times New Roman" w:cs="Times New Roman"/>
-          <w:sz w:val="26"/>
-          <w:szCs w:val="26"/>
-        </w:rPr>
-        <w:t>Bảng 3.x. Chi phí nhân sự theo bộ phận</w:t>
-      </w:r>
+        <w:rPr>
+          <w:rFonts w:ascii="Times New Roman" w:hAnsi="Times New Roman" w:cs="Times New Roman"/>
+          <w:b/>
+          <w:bCs/>
+          <w:sz w:val="26"/>
+          <w:szCs w:val="26"/>
+        </w:rPr>
+      </w:pPr>
     </w:p>
     <w:p>
       <w:pPr>
@@ -5290,7 +5219,6 @@
                 <w:b/>
                 <w:bCs/>
               </w:rPr>
-              <w:lastRenderedPageBreak/>
               <w:t>Bộ phận</w:t>
             </w:r>
           </w:p>
@@ -5592,6 +5520,7 @@
                 <w:rStyle w:val="Strong"/>
                 <w:rFonts w:ascii="Times New Roman" w:hAnsi="Times New Roman" w:cs="Times New Roman"/>
               </w:rPr>
+              <w:lastRenderedPageBreak/>
               <w:t>Tổng cộng</w:t>
             </w:r>
           </w:p>
@@ -5648,21 +5577,14 @@
     </w:tbl>
     <w:p>
       <w:pPr>
-        <w:jc w:val="center"/>
-        <w:rPr>
-          <w:rFonts w:ascii="Times New Roman" w:hAnsi="Times New Roman" w:cs="Times New Roman"/>
-          <w:sz w:val="26"/>
-          <w:szCs w:val="26"/>
-        </w:rPr>
-      </w:pPr>
-      <w:r>
-        <w:rPr>
-          <w:rFonts w:ascii="Times New Roman" w:hAnsi="Times New Roman" w:cs="Times New Roman"/>
-          <w:sz w:val="26"/>
-          <w:szCs w:val="26"/>
-        </w:rPr>
-        <w:t>Bảng 3.x. Chi phí xử lý theo bộ phận</w:t>
-      </w:r>
+        <w:rPr>
+          <w:rFonts w:ascii="Times New Roman" w:hAnsi="Times New Roman" w:cs="Times New Roman"/>
+          <w:b/>
+          <w:bCs/>
+          <w:sz w:val="26"/>
+          <w:szCs w:val="26"/>
+        </w:rPr>
+      </w:pPr>
     </w:p>
     <w:p>
       <w:pPr>
@@ -5946,14 +5868,6 @@
           <w:szCs w:val="26"/>
         </w:rPr>
       </w:pPr>
-      <w:r>
-        <w:rPr>
-          <w:rFonts w:ascii="Times New Roman" w:hAnsi="Times New Roman" w:cs="Times New Roman"/>
-          <w:sz w:val="26"/>
-          <w:szCs w:val="26"/>
-        </w:rPr>
-        <w:t>Bảng 3.x. Tổng hợp chi phí xử lý quy trình</w:t>
-      </w:r>
     </w:p>
     <w:sectPr>
       <w:pgSz w:w="12240" w:h="15840"/>
@@ -7788,6 +7702,7 @@
   <w:style w:type="character" w:default="1" w:styleId="DefaultParagraphFont">
     <w:name w:val="Default Paragraph Font"/>
     <w:uiPriority w:val="1"/>
+    <w:semiHidden/>
     <w:unhideWhenUsed/>
   </w:style>
   <w:style w:type="table" w:default="1" w:styleId="TableNormal">

</xml_diff>

<commit_message>
docs(bpmn): cập nhật tài liệu và sơ đồ quy trình hoàn trả CSKH Viettel Post
</commit_message>
<xml_diff>
--- a/01.WORKING_SPACE/hau/quytrinhquanlitrahang.docx
+++ b/01.WORKING_SPACE/hau/quytrinhquanlitrahang.docx
@@ -424,7 +424,13 @@
         </w:rPr>
       </w:pPr>
       <w:r>
-        <w:rPr/>
+        <w:rPr>
+          <w:rFonts w:cs="Times New Roman" w:ascii="Times New Roman" w:hAnsi="Times New Roman"/>
+          <w:b/>
+          <w:bCs/>
+          <w:sz w:val="26"/>
+          <w:szCs w:val="26"/>
+        </w:rPr>
         <w:drawing>
           <wp:anchor distT="0" distB="0" distL="0" distR="0" simplePos="0" relativeHeight="2" behindDoc="0" locked="0" layoutInCell="0" allowOverlap="1">
             <wp:simplePos x="0" y="0"/>
@@ -434,7 +440,7 @@
             <wp:positionV relativeFrom="paragraph">
               <wp:posOffset>635</wp:posOffset>
             </wp:positionV>
-            <wp:extent cx="5943600" cy="3105150"/>
+            <wp:extent cx="5943600" cy="2610485"/>
             <wp:effectExtent l="0" t="0" r="0" b="0"/>
             <wp:wrapSquare wrapText="largest"/>
             <wp:docPr id="1" name="Image1"/>
@@ -459,7 +465,7 @@
                   <pic:spPr bwMode="auto">
                     <a:xfrm>
                       <a:off x="0" y="0"/>
-                      <a:ext cx="5943600" cy="3105150"/>
+                      <a:ext cx="5943600" cy="2610485"/>
                     </a:xfrm>
                     <a:prstGeom prst="rect">
                       <a:avLst/>
@@ -1180,6 +1186,7 @@
             <w:pPr>
               <w:pStyle w:val="Normal"/>
               <w:widowControl/>
+              <w:suppressAutoHyphens w:val="true"/>
               <w:spacing w:lineRule="auto" w:line="240" w:before="0" w:after="0"/>
               <w:jc w:val="start"/>
               <w:rPr>
@@ -1214,6 +1221,7 @@
             <w:pPr>
               <w:pStyle w:val="Normal"/>
               <w:widowControl/>
+              <w:suppressAutoHyphens w:val="true"/>
               <w:spacing w:lineRule="auto" w:line="240" w:before="0" w:after="0"/>
               <w:jc w:val="start"/>
               <w:rPr>
@@ -1248,6 +1256,7 @@
             <w:pPr>
               <w:pStyle w:val="Normal"/>
               <w:widowControl/>
+              <w:suppressAutoHyphens w:val="true"/>
               <w:spacing w:lineRule="auto" w:line="240" w:before="0" w:after="0"/>
               <w:jc w:val="start"/>
               <w:rPr>
@@ -1287,6 +1296,7 @@
             <w:pPr>
               <w:pStyle w:val="Normal"/>
               <w:widowControl/>
+              <w:suppressAutoHyphens w:val="true"/>
               <w:spacing w:lineRule="auto" w:line="240" w:before="0" w:after="0"/>
               <w:jc w:val="start"/>
               <w:rPr>
@@ -1319,6 +1329,7 @@
             <w:pPr>
               <w:pStyle w:val="Normal"/>
               <w:widowControl/>
+              <w:suppressAutoHyphens w:val="true"/>
               <w:spacing w:lineRule="auto" w:line="240" w:before="0" w:after="0"/>
               <w:jc w:val="start"/>
               <w:rPr>
@@ -1351,6 +1362,7 @@
             <w:pPr>
               <w:pStyle w:val="Normal"/>
               <w:widowControl/>
+              <w:suppressAutoHyphens w:val="true"/>
               <w:spacing w:lineRule="auto" w:line="240" w:before="0" w:after="0"/>
               <w:jc w:val="start"/>
               <w:rPr>
@@ -1388,6 +1400,7 @@
             <w:pPr>
               <w:pStyle w:val="Normal"/>
               <w:widowControl/>
+              <w:suppressAutoHyphens w:val="true"/>
               <w:spacing w:lineRule="auto" w:line="240" w:before="0" w:after="0"/>
               <w:jc w:val="start"/>
               <w:rPr>
@@ -1420,6 +1433,7 @@
             <w:pPr>
               <w:pStyle w:val="Normal"/>
               <w:widowControl/>
+              <w:suppressAutoHyphens w:val="true"/>
               <w:spacing w:lineRule="auto" w:line="240" w:before="0" w:after="0"/>
               <w:jc w:val="start"/>
               <w:rPr>
@@ -1452,6 +1466,7 @@
             <w:pPr>
               <w:pStyle w:val="Normal"/>
               <w:widowControl/>
+              <w:suppressAutoHyphens w:val="true"/>
               <w:spacing w:lineRule="auto" w:line="240" w:before="0" w:after="0"/>
               <w:jc w:val="start"/>
               <w:rPr>
@@ -1489,6 +1504,7 @@
             <w:pPr>
               <w:pStyle w:val="Normal"/>
               <w:widowControl/>
+              <w:suppressAutoHyphens w:val="true"/>
               <w:spacing w:lineRule="auto" w:line="240" w:before="0" w:after="0"/>
               <w:jc w:val="start"/>
               <w:rPr>
@@ -1521,6 +1537,7 @@
             <w:pPr>
               <w:pStyle w:val="Normal"/>
               <w:widowControl/>
+              <w:suppressAutoHyphens w:val="true"/>
               <w:spacing w:lineRule="auto" w:line="240" w:before="0" w:after="0"/>
               <w:jc w:val="start"/>
               <w:rPr>
@@ -1553,6 +1570,7 @@
             <w:pPr>
               <w:pStyle w:val="Normal"/>
               <w:widowControl/>
+              <w:suppressAutoHyphens w:val="true"/>
               <w:spacing w:lineRule="auto" w:line="240" w:before="0" w:after="0"/>
               <w:jc w:val="start"/>
               <w:rPr>
@@ -1590,6 +1608,7 @@
             <w:pPr>
               <w:pStyle w:val="Normal"/>
               <w:widowControl/>
+              <w:suppressAutoHyphens w:val="true"/>
               <w:spacing w:lineRule="auto" w:line="240" w:before="0" w:after="0"/>
               <w:jc w:val="start"/>
               <w:rPr>
@@ -1622,6 +1641,7 @@
             <w:pPr>
               <w:pStyle w:val="Normal"/>
               <w:widowControl/>
+              <w:suppressAutoHyphens w:val="true"/>
               <w:spacing w:lineRule="auto" w:line="240" w:before="0" w:after="0"/>
               <w:jc w:val="start"/>
               <w:rPr>
@@ -1654,6 +1674,7 @@
             <w:pPr>
               <w:pStyle w:val="Normal"/>
               <w:widowControl/>
+              <w:suppressAutoHyphens w:val="true"/>
               <w:spacing w:lineRule="auto" w:line="240" w:before="0" w:after="0"/>
               <w:jc w:val="start"/>
               <w:rPr>
@@ -1689,6 +1710,7 @@
             <w:pPr>
               <w:pStyle w:val="Normal"/>
               <w:widowControl/>
+              <w:suppressAutoHyphens w:val="true"/>
               <w:spacing w:lineRule="auto" w:line="240" w:before="0" w:after="0"/>
               <w:jc w:val="start"/>
               <w:rPr>
@@ -1721,6 +1743,7 @@
             <w:pPr>
               <w:pStyle w:val="Normal"/>
               <w:widowControl/>
+              <w:suppressAutoHyphens w:val="true"/>
               <w:spacing w:lineRule="auto" w:line="240" w:before="0" w:after="0"/>
               <w:jc w:val="start"/>
               <w:rPr>
@@ -1753,6 +1776,7 @@
             <w:pPr>
               <w:pStyle w:val="Normal"/>
               <w:widowControl/>
+              <w:suppressAutoHyphens w:val="true"/>
               <w:spacing w:lineRule="auto" w:line="240" w:before="0" w:after="0"/>
               <w:jc w:val="start"/>
               <w:rPr>
@@ -1790,6 +1814,7 @@
             <w:pPr>
               <w:pStyle w:val="Normal"/>
               <w:widowControl/>
+              <w:suppressAutoHyphens w:val="true"/>
               <w:spacing w:lineRule="auto" w:line="240" w:before="0" w:after="0"/>
               <w:jc w:val="start"/>
               <w:rPr>
@@ -1822,6 +1847,7 @@
             <w:pPr>
               <w:pStyle w:val="Normal"/>
               <w:widowControl/>
+              <w:suppressAutoHyphens w:val="true"/>
               <w:spacing w:lineRule="auto" w:line="240" w:before="0" w:after="0"/>
               <w:jc w:val="start"/>
               <w:rPr>
@@ -1854,6 +1880,7 @@
             <w:pPr>
               <w:pStyle w:val="Normal"/>
               <w:widowControl/>
+              <w:suppressAutoHyphens w:val="true"/>
               <w:spacing w:lineRule="auto" w:line="240" w:before="0" w:after="0"/>
               <w:jc w:val="start"/>
               <w:rPr>
@@ -1891,6 +1918,7 @@
             <w:pPr>
               <w:pStyle w:val="Normal"/>
               <w:widowControl/>
+              <w:suppressAutoHyphens w:val="true"/>
               <w:spacing w:lineRule="auto" w:line="240" w:before="0" w:after="0"/>
               <w:jc w:val="start"/>
               <w:rPr>
@@ -1923,6 +1951,7 @@
             <w:pPr>
               <w:pStyle w:val="Normal"/>
               <w:widowControl/>
+              <w:suppressAutoHyphens w:val="true"/>
               <w:spacing w:lineRule="auto" w:line="240" w:before="0" w:after="0"/>
               <w:jc w:val="start"/>
               <w:rPr>
@@ -1955,6 +1984,7 @@
             <w:pPr>
               <w:pStyle w:val="Normal"/>
               <w:widowControl/>
+              <w:suppressAutoHyphens w:val="true"/>
               <w:spacing w:lineRule="auto" w:line="240" w:before="0" w:after="0"/>
               <w:jc w:val="start"/>
               <w:rPr>
@@ -1992,6 +2022,7 @@
             <w:pPr>
               <w:pStyle w:val="Normal"/>
               <w:widowControl/>
+              <w:suppressAutoHyphens w:val="true"/>
               <w:spacing w:lineRule="auto" w:line="240" w:before="0" w:after="0"/>
               <w:jc w:val="start"/>
               <w:rPr>
@@ -2024,6 +2055,7 @@
             <w:pPr>
               <w:pStyle w:val="Normal"/>
               <w:widowControl/>
+              <w:suppressAutoHyphens w:val="true"/>
               <w:spacing w:lineRule="auto" w:line="240" w:before="0" w:after="0"/>
               <w:jc w:val="start"/>
               <w:rPr>
@@ -2056,6 +2088,7 @@
             <w:pPr>
               <w:pStyle w:val="Normal"/>
               <w:widowControl/>
+              <w:suppressAutoHyphens w:val="true"/>
               <w:spacing w:lineRule="auto" w:line="240" w:before="0" w:after="0"/>
               <w:jc w:val="start"/>
               <w:rPr>
@@ -2091,6 +2124,7 @@
             <w:pPr>
               <w:pStyle w:val="Normal"/>
               <w:widowControl/>
+              <w:suppressAutoHyphens w:val="true"/>
               <w:spacing w:lineRule="auto" w:line="240" w:before="0" w:after="0"/>
               <w:jc w:val="start"/>
               <w:rPr>
@@ -2123,6 +2157,7 @@
             <w:pPr>
               <w:pStyle w:val="Normal"/>
               <w:widowControl/>
+              <w:suppressAutoHyphens w:val="true"/>
               <w:spacing w:lineRule="auto" w:line="240" w:before="0" w:after="0"/>
               <w:jc w:val="start"/>
               <w:rPr>
@@ -2155,6 +2190,7 @@
             <w:pPr>
               <w:pStyle w:val="Normal"/>
               <w:widowControl/>
+              <w:suppressAutoHyphens w:val="true"/>
               <w:spacing w:lineRule="auto" w:line="240" w:before="0" w:after="0"/>
               <w:jc w:val="start"/>
               <w:rPr>
@@ -2192,6 +2228,7 @@
             <w:pPr>
               <w:pStyle w:val="Normal"/>
               <w:widowControl/>
+              <w:suppressAutoHyphens w:val="true"/>
               <w:spacing w:lineRule="auto" w:line="240" w:before="0" w:after="0"/>
               <w:jc w:val="start"/>
               <w:rPr>
@@ -2224,6 +2261,7 @@
             <w:pPr>
               <w:pStyle w:val="Normal"/>
               <w:widowControl/>
+              <w:suppressAutoHyphens w:val="true"/>
               <w:spacing w:lineRule="auto" w:line="240" w:before="0" w:after="0"/>
               <w:jc w:val="start"/>
               <w:rPr>
@@ -2256,6 +2294,7 @@
             <w:pPr>
               <w:pStyle w:val="Normal"/>
               <w:widowControl/>
+              <w:suppressAutoHyphens w:val="true"/>
               <w:spacing w:lineRule="auto" w:line="240" w:before="0" w:after="0"/>
               <w:jc w:val="start"/>
               <w:rPr>
@@ -2293,6 +2332,7 @@
             <w:pPr>
               <w:pStyle w:val="Normal"/>
               <w:widowControl/>
+              <w:suppressAutoHyphens w:val="true"/>
               <w:spacing w:lineRule="auto" w:line="240" w:before="0" w:after="0"/>
               <w:jc w:val="start"/>
               <w:rPr>
@@ -2325,6 +2365,7 @@
             <w:pPr>
               <w:pStyle w:val="Normal"/>
               <w:widowControl/>
+              <w:suppressAutoHyphens w:val="true"/>
               <w:spacing w:lineRule="auto" w:line="240" w:before="0" w:after="0"/>
               <w:jc w:val="start"/>
               <w:rPr>
@@ -2357,6 +2398,7 @@
             <w:pPr>
               <w:pStyle w:val="Normal"/>
               <w:widowControl/>
+              <w:suppressAutoHyphens w:val="true"/>
               <w:spacing w:lineRule="auto" w:line="240" w:before="0" w:after="0"/>
               <w:jc w:val="start"/>
               <w:rPr>
@@ -2394,6 +2436,7 @@
             <w:pPr>
               <w:pStyle w:val="Normal"/>
               <w:widowControl/>
+              <w:suppressAutoHyphens w:val="true"/>
               <w:spacing w:lineRule="auto" w:line="240" w:before="0" w:after="0"/>
               <w:jc w:val="start"/>
               <w:rPr>
@@ -2426,6 +2469,7 @@
             <w:pPr>
               <w:pStyle w:val="Normal"/>
               <w:widowControl/>
+              <w:suppressAutoHyphens w:val="true"/>
               <w:spacing w:lineRule="auto" w:line="240" w:before="0" w:after="0"/>
               <w:jc w:val="start"/>
               <w:rPr>
@@ -2458,6 +2502,7 @@
             <w:pPr>
               <w:pStyle w:val="Normal"/>
               <w:widowControl/>
+              <w:suppressAutoHyphens w:val="true"/>
               <w:spacing w:lineRule="auto" w:line="240" w:before="0" w:after="0"/>
               <w:jc w:val="start"/>
               <w:rPr>
@@ -2493,6 +2538,7 @@
             <w:pPr>
               <w:pStyle w:val="Normal"/>
               <w:widowControl/>
+              <w:suppressAutoHyphens w:val="true"/>
               <w:spacing w:lineRule="auto" w:line="240" w:before="0" w:after="0"/>
               <w:jc w:val="start"/>
               <w:rPr>
@@ -2525,6 +2571,7 @@
             <w:pPr>
               <w:pStyle w:val="Normal"/>
               <w:widowControl/>
+              <w:suppressAutoHyphens w:val="true"/>
               <w:spacing w:lineRule="auto" w:line="240" w:before="0" w:after="0"/>
               <w:jc w:val="start"/>
               <w:rPr>
@@ -2557,6 +2604,7 @@
             <w:pPr>
               <w:pStyle w:val="Normal"/>
               <w:widowControl/>
+              <w:suppressAutoHyphens w:val="true"/>
               <w:spacing w:lineRule="auto" w:line="240" w:before="0" w:after="0"/>
               <w:jc w:val="start"/>
               <w:rPr>
@@ -2594,6 +2642,7 @@
             <w:pPr>
               <w:pStyle w:val="Normal"/>
               <w:widowControl/>
+              <w:suppressAutoHyphens w:val="true"/>
               <w:spacing w:lineRule="auto" w:line="240" w:before="0" w:after="0"/>
               <w:jc w:val="start"/>
               <w:rPr>
@@ -2626,6 +2675,7 @@
             <w:pPr>
               <w:pStyle w:val="Normal"/>
               <w:widowControl/>
+              <w:suppressAutoHyphens w:val="true"/>
               <w:spacing w:lineRule="auto" w:line="240" w:before="0" w:after="0"/>
               <w:jc w:val="start"/>
               <w:rPr>
@@ -2658,6 +2708,7 @@
             <w:pPr>
               <w:pStyle w:val="Normal"/>
               <w:widowControl/>
+              <w:suppressAutoHyphens w:val="true"/>
               <w:spacing w:lineRule="auto" w:line="240" w:before="0" w:after="0"/>
               <w:jc w:val="start"/>
               <w:rPr>
@@ -2751,8 +2802,8 @@
         <w:tblLook w:noHBand="0" w:noVBand="1" w:firstColumn="1" w:lastRow="0" w:lastColumn="0" w:firstRow="1" w:val="04a0"/>
       </w:tblPr>
       <w:tblGrid>
-        <w:gridCol w:w="2334"/>
-        <w:gridCol w:w="7016"/>
+        <w:gridCol w:w="2333"/>
+        <w:gridCol w:w="7017"/>
       </w:tblGrid>
       <w:tr>
         <w:trPr>
@@ -2760,14 +2811,15 @@
         </w:trPr>
         <w:tc>
           <w:tcPr>
-            <w:tcW w:w="2334" w:type="dxa"/>
-            <w:tcBorders/>
-            <w:vAlign w:val="center"/>
-          </w:tcPr>
-          <w:p>
-            <w:pPr>
-              <w:pStyle w:val="Normal"/>
-              <w:widowControl/>
+            <w:tcW w:w="2333" w:type="dxa"/>
+            <w:tcBorders/>
+            <w:vAlign w:val="center"/>
+          </w:tcPr>
+          <w:p>
+            <w:pPr>
+              <w:pStyle w:val="Normal"/>
+              <w:widowControl/>
+              <w:suppressAutoHyphens w:val="true"/>
               <w:spacing w:lineRule="auto" w:line="240" w:before="0" w:after="0"/>
               <w:jc w:val="start"/>
               <w:rPr>
@@ -2794,14 +2846,15 @@
         </w:tc>
         <w:tc>
           <w:tcPr>
-            <w:tcW w:w="7016" w:type="dxa"/>
-            <w:tcBorders/>
-            <w:vAlign w:val="center"/>
-          </w:tcPr>
-          <w:p>
-            <w:pPr>
-              <w:pStyle w:val="Normal"/>
-              <w:widowControl/>
+            <w:tcW w:w="7017" w:type="dxa"/>
+            <w:tcBorders/>
+            <w:vAlign w:val="center"/>
+          </w:tcPr>
+          <w:p>
+            <w:pPr>
+              <w:pStyle w:val="Normal"/>
+              <w:widowControl/>
+              <w:suppressAutoHyphens w:val="true"/>
               <w:spacing w:lineRule="auto" w:line="240" w:before="0" w:after="0"/>
               <w:jc w:val="start"/>
               <w:rPr>
@@ -2833,14 +2886,15 @@
         </w:trPr>
         <w:tc>
           <w:tcPr>
-            <w:tcW w:w="2334" w:type="dxa"/>
-            <w:tcBorders/>
-            <w:vAlign w:val="center"/>
-          </w:tcPr>
-          <w:p>
-            <w:pPr>
-              <w:pStyle w:val="Normal"/>
-              <w:widowControl/>
+            <w:tcW w:w="2333" w:type="dxa"/>
+            <w:tcBorders/>
+            <w:vAlign w:val="center"/>
+          </w:tcPr>
+          <w:p>
+            <w:pPr>
+              <w:pStyle w:val="Normal"/>
+              <w:widowControl/>
+              <w:suppressAutoHyphens w:val="true"/>
               <w:spacing w:lineRule="auto" w:line="240" w:before="0" w:after="0"/>
               <w:jc w:val="start"/>
               <w:rPr>
@@ -2866,14 +2920,15 @@
         </w:tc>
         <w:tc>
           <w:tcPr>
-            <w:tcW w:w="7016" w:type="dxa"/>
-            <w:tcBorders/>
-            <w:vAlign w:val="center"/>
-          </w:tcPr>
-          <w:p>
-            <w:pPr>
-              <w:pStyle w:val="Normal"/>
-              <w:widowControl/>
+            <w:tcW w:w="7017" w:type="dxa"/>
+            <w:tcBorders/>
+            <w:vAlign w:val="center"/>
+          </w:tcPr>
+          <w:p>
+            <w:pPr>
+              <w:pStyle w:val="Normal"/>
+              <w:widowControl/>
+              <w:suppressAutoHyphens w:val="true"/>
               <w:spacing w:lineRule="auto" w:line="240" w:before="0" w:after="0"/>
               <w:jc w:val="start"/>
               <w:rPr>
@@ -2901,14 +2956,15 @@
         <w:trPr/>
         <w:tc>
           <w:tcPr>
-            <w:tcW w:w="2334" w:type="dxa"/>
-            <w:tcBorders/>
-            <w:vAlign w:val="center"/>
-          </w:tcPr>
-          <w:p>
-            <w:pPr>
-              <w:pStyle w:val="Normal"/>
-              <w:widowControl/>
+            <w:tcW w:w="2333" w:type="dxa"/>
+            <w:tcBorders/>
+            <w:vAlign w:val="center"/>
+          </w:tcPr>
+          <w:p>
+            <w:pPr>
+              <w:pStyle w:val="Normal"/>
+              <w:widowControl/>
+              <w:suppressAutoHyphens w:val="true"/>
               <w:spacing w:lineRule="auto" w:line="240" w:before="0" w:after="0"/>
               <w:jc w:val="start"/>
               <w:rPr>
@@ -2934,14 +2990,15 @@
         </w:tc>
         <w:tc>
           <w:tcPr>
-            <w:tcW w:w="7016" w:type="dxa"/>
-            <w:tcBorders/>
-            <w:vAlign w:val="center"/>
-          </w:tcPr>
-          <w:p>
-            <w:pPr>
-              <w:pStyle w:val="Normal"/>
-              <w:widowControl/>
+            <w:tcW w:w="7017" w:type="dxa"/>
+            <w:tcBorders/>
+            <w:vAlign w:val="center"/>
+          </w:tcPr>
+          <w:p>
+            <w:pPr>
+              <w:pStyle w:val="Normal"/>
+              <w:widowControl/>
+              <w:suppressAutoHyphens w:val="true"/>
               <w:spacing w:lineRule="auto" w:line="240" w:before="0" w:after="0"/>
               <w:jc w:val="start"/>
               <w:rPr>
@@ -2969,14 +3026,15 @@
         <w:trPr/>
         <w:tc>
           <w:tcPr>
-            <w:tcW w:w="2334" w:type="dxa"/>
-            <w:tcBorders/>
-            <w:vAlign w:val="center"/>
-          </w:tcPr>
-          <w:p>
-            <w:pPr>
-              <w:pStyle w:val="Normal"/>
-              <w:widowControl/>
+            <w:tcW w:w="2333" w:type="dxa"/>
+            <w:tcBorders/>
+            <w:vAlign w:val="center"/>
+          </w:tcPr>
+          <w:p>
+            <w:pPr>
+              <w:pStyle w:val="Normal"/>
+              <w:widowControl/>
+              <w:suppressAutoHyphens w:val="true"/>
               <w:spacing w:lineRule="auto" w:line="240" w:before="0" w:after="0"/>
               <w:jc w:val="start"/>
               <w:rPr>
@@ -3002,14 +3060,15 @@
         </w:tc>
         <w:tc>
           <w:tcPr>
-            <w:tcW w:w="7016" w:type="dxa"/>
-            <w:tcBorders/>
-            <w:vAlign w:val="center"/>
-          </w:tcPr>
-          <w:p>
-            <w:pPr>
-              <w:pStyle w:val="Normal"/>
-              <w:widowControl/>
+            <w:tcW w:w="7017" w:type="dxa"/>
+            <w:tcBorders/>
+            <w:vAlign w:val="center"/>
+          </w:tcPr>
+          <w:p>
+            <w:pPr>
+              <w:pStyle w:val="Normal"/>
+              <w:widowControl/>
+              <w:suppressAutoHyphens w:val="true"/>
               <w:spacing w:lineRule="auto" w:line="240" w:before="0" w:after="0"/>
               <w:jc w:val="start"/>
               <w:rPr>
@@ -3037,14 +3096,15 @@
         <w:trPr/>
         <w:tc>
           <w:tcPr>
-            <w:tcW w:w="2334" w:type="dxa"/>
-            <w:tcBorders/>
-            <w:vAlign w:val="center"/>
-          </w:tcPr>
-          <w:p>
-            <w:pPr>
-              <w:pStyle w:val="Normal"/>
-              <w:widowControl/>
+            <w:tcW w:w="2333" w:type="dxa"/>
+            <w:tcBorders/>
+            <w:vAlign w:val="center"/>
+          </w:tcPr>
+          <w:p>
+            <w:pPr>
+              <w:pStyle w:val="Normal"/>
+              <w:widowControl/>
+              <w:suppressAutoHyphens w:val="true"/>
               <w:spacing w:lineRule="auto" w:line="240" w:before="0" w:after="0"/>
               <w:jc w:val="start"/>
               <w:rPr>
@@ -3070,14 +3130,15 @@
         </w:tc>
         <w:tc>
           <w:tcPr>
-            <w:tcW w:w="7016" w:type="dxa"/>
-            <w:tcBorders/>
-            <w:vAlign w:val="center"/>
-          </w:tcPr>
-          <w:p>
-            <w:pPr>
-              <w:pStyle w:val="Normal"/>
-              <w:widowControl/>
+            <w:tcW w:w="7017" w:type="dxa"/>
+            <w:tcBorders/>
+            <w:vAlign w:val="center"/>
+          </w:tcPr>
+          <w:p>
+            <w:pPr>
+              <w:pStyle w:val="Normal"/>
+              <w:widowControl/>
+              <w:suppressAutoHyphens w:val="true"/>
               <w:spacing w:lineRule="auto" w:line="240" w:before="0" w:after="0"/>
               <w:jc w:val="start"/>
               <w:rPr>
@@ -3105,14 +3166,15 @@
         <w:trPr/>
         <w:tc>
           <w:tcPr>
-            <w:tcW w:w="2334" w:type="dxa"/>
-            <w:tcBorders/>
-            <w:vAlign w:val="center"/>
-          </w:tcPr>
-          <w:p>
-            <w:pPr>
-              <w:pStyle w:val="Normal"/>
-              <w:widowControl/>
+            <w:tcW w:w="2333" w:type="dxa"/>
+            <w:tcBorders/>
+            <w:vAlign w:val="center"/>
+          </w:tcPr>
+          <w:p>
+            <w:pPr>
+              <w:pStyle w:val="Normal"/>
+              <w:widowControl/>
+              <w:suppressAutoHyphens w:val="true"/>
               <w:spacing w:lineRule="auto" w:line="240" w:before="0" w:after="0"/>
               <w:jc w:val="start"/>
               <w:rPr>
@@ -3138,14 +3200,15 @@
         </w:tc>
         <w:tc>
           <w:tcPr>
-            <w:tcW w:w="7016" w:type="dxa"/>
-            <w:tcBorders/>
-            <w:vAlign w:val="center"/>
-          </w:tcPr>
-          <w:p>
-            <w:pPr>
-              <w:pStyle w:val="Normal"/>
-              <w:widowControl/>
+            <w:tcW w:w="7017" w:type="dxa"/>
+            <w:tcBorders/>
+            <w:vAlign w:val="center"/>
+          </w:tcPr>
+          <w:p>
+            <w:pPr>
+              <w:pStyle w:val="Normal"/>
+              <w:widowControl/>
+              <w:suppressAutoHyphens w:val="true"/>
               <w:spacing w:lineRule="auto" w:line="240" w:before="0" w:after="0"/>
               <w:jc w:val="start"/>
               <w:rPr>
@@ -3173,14 +3236,15 @@
         <w:trPr/>
         <w:tc>
           <w:tcPr>
-            <w:tcW w:w="2334" w:type="dxa"/>
-            <w:tcBorders/>
-            <w:vAlign w:val="center"/>
-          </w:tcPr>
-          <w:p>
-            <w:pPr>
-              <w:pStyle w:val="Normal"/>
-              <w:widowControl/>
+            <w:tcW w:w="2333" w:type="dxa"/>
+            <w:tcBorders/>
+            <w:vAlign w:val="center"/>
+          </w:tcPr>
+          <w:p>
+            <w:pPr>
+              <w:pStyle w:val="Normal"/>
+              <w:widowControl/>
+              <w:suppressAutoHyphens w:val="true"/>
               <w:spacing w:lineRule="auto" w:line="240" w:before="0" w:after="0"/>
               <w:jc w:val="start"/>
               <w:rPr>
@@ -3206,14 +3270,15 @@
         </w:tc>
         <w:tc>
           <w:tcPr>
-            <w:tcW w:w="7016" w:type="dxa"/>
-            <w:tcBorders/>
-            <w:vAlign w:val="center"/>
-          </w:tcPr>
-          <w:p>
-            <w:pPr>
-              <w:pStyle w:val="Normal"/>
-              <w:widowControl/>
+            <w:tcW w:w="7017" w:type="dxa"/>
+            <w:tcBorders/>
+            <w:vAlign w:val="center"/>
+          </w:tcPr>
+          <w:p>
+            <w:pPr>
+              <w:pStyle w:val="Normal"/>
+              <w:widowControl/>
+              <w:suppressAutoHyphens w:val="true"/>
               <w:spacing w:lineRule="auto" w:line="240" w:before="0" w:after="0"/>
               <w:jc w:val="start"/>
               <w:rPr>
@@ -3389,6 +3454,7 @@
             <w:pPr>
               <w:pStyle w:val="Normal"/>
               <w:widowControl/>
+              <w:suppressAutoHyphens w:val="true"/>
               <w:spacing w:lineRule="auto" w:line="240" w:before="0" w:after="0"/>
               <w:jc w:val="start"/>
               <w:rPr>
@@ -3423,6 +3489,7 @@
             <w:pPr>
               <w:pStyle w:val="Normal"/>
               <w:widowControl/>
+              <w:suppressAutoHyphens w:val="true"/>
               <w:spacing w:lineRule="auto" w:line="240" w:before="0" w:after="0"/>
               <w:jc w:val="start"/>
               <w:rPr>
@@ -3457,6 +3524,7 @@
             <w:pPr>
               <w:pStyle w:val="Normal"/>
               <w:widowControl/>
+              <w:suppressAutoHyphens w:val="true"/>
               <w:spacing w:lineRule="auto" w:line="240" w:before="0" w:after="0"/>
               <w:jc w:val="start"/>
               <w:rPr>
@@ -3491,6 +3559,7 @@
             <w:pPr>
               <w:pStyle w:val="Normal"/>
               <w:widowControl/>
+              <w:suppressAutoHyphens w:val="true"/>
               <w:spacing w:lineRule="auto" w:line="240" w:before="0" w:after="0"/>
               <w:jc w:val="start"/>
               <w:rPr>
@@ -3528,6 +3597,7 @@
             <w:pPr>
               <w:pStyle w:val="Normal"/>
               <w:widowControl/>
+              <w:suppressAutoHyphens w:val="true"/>
               <w:spacing w:lineRule="auto" w:line="240" w:before="0" w:after="0"/>
               <w:jc w:val="start"/>
               <w:rPr>
@@ -3560,6 +3630,7 @@
             <w:pPr>
               <w:pStyle w:val="Normal"/>
               <w:widowControl/>
+              <w:suppressAutoHyphens w:val="true"/>
               <w:spacing w:lineRule="auto" w:line="240" w:before="0" w:after="0"/>
               <w:jc w:val="start"/>
               <w:rPr>
@@ -3592,6 +3663,7 @@
             <w:pPr>
               <w:pStyle w:val="Normal"/>
               <w:widowControl/>
+              <w:suppressAutoHyphens w:val="true"/>
               <w:spacing w:lineRule="auto" w:line="240" w:before="0" w:after="0"/>
               <w:jc w:val="start"/>
               <w:rPr>
@@ -3624,6 +3696,7 @@
             <w:pPr>
               <w:pStyle w:val="Normal"/>
               <w:widowControl/>
+              <w:suppressAutoHyphens w:val="true"/>
               <w:spacing w:lineRule="auto" w:line="240" w:before="0" w:after="0"/>
               <w:jc w:val="start"/>
               <w:rPr>
@@ -3659,6 +3732,7 @@
             <w:pPr>
               <w:pStyle w:val="Normal"/>
               <w:widowControl/>
+              <w:suppressAutoHyphens w:val="true"/>
               <w:spacing w:lineRule="auto" w:line="240" w:before="0" w:after="0"/>
               <w:jc w:val="start"/>
               <w:rPr>
@@ -3691,6 +3765,7 @@
             <w:pPr>
               <w:pStyle w:val="Normal"/>
               <w:widowControl/>
+              <w:suppressAutoHyphens w:val="true"/>
               <w:spacing w:lineRule="auto" w:line="240" w:before="0" w:after="0"/>
               <w:jc w:val="start"/>
               <w:rPr>
@@ -3723,6 +3798,7 @@
             <w:pPr>
               <w:pStyle w:val="Normal"/>
               <w:widowControl/>
+              <w:suppressAutoHyphens w:val="true"/>
               <w:spacing w:lineRule="auto" w:line="240" w:before="0" w:after="0"/>
               <w:jc w:val="start"/>
               <w:rPr>
@@ -3755,6 +3831,7 @@
             <w:pPr>
               <w:pStyle w:val="Normal"/>
               <w:widowControl/>
+              <w:suppressAutoHyphens w:val="true"/>
               <w:spacing w:lineRule="auto" w:line="240" w:before="0" w:after="0"/>
               <w:jc w:val="start"/>
               <w:rPr>
@@ -3790,6 +3867,7 @@
             <w:pPr>
               <w:pStyle w:val="Normal"/>
               <w:widowControl/>
+              <w:suppressAutoHyphens w:val="true"/>
               <w:spacing w:lineRule="auto" w:line="240" w:before="0" w:after="0"/>
               <w:jc w:val="start"/>
               <w:rPr>
@@ -3822,6 +3900,7 @@
             <w:pPr>
               <w:pStyle w:val="Normal"/>
               <w:widowControl/>
+              <w:suppressAutoHyphens w:val="true"/>
               <w:spacing w:lineRule="auto" w:line="240" w:before="0" w:after="0"/>
               <w:jc w:val="start"/>
               <w:rPr>
@@ -3854,6 +3933,7 @@
             <w:pPr>
               <w:pStyle w:val="Normal"/>
               <w:widowControl/>
+              <w:suppressAutoHyphens w:val="true"/>
               <w:spacing w:lineRule="auto" w:line="240" w:before="0" w:after="0"/>
               <w:jc w:val="start"/>
               <w:rPr>
@@ -3886,6 +3966,7 @@
             <w:pPr>
               <w:pStyle w:val="Normal"/>
               <w:widowControl/>
+              <w:suppressAutoHyphens w:val="true"/>
               <w:spacing w:lineRule="auto" w:line="240" w:before="0" w:after="0"/>
               <w:jc w:val="start"/>
               <w:rPr>
@@ -3921,6 +4002,7 @@
             <w:pPr>
               <w:pStyle w:val="Normal"/>
               <w:widowControl/>
+              <w:suppressAutoHyphens w:val="true"/>
               <w:spacing w:lineRule="auto" w:line="240" w:before="0" w:after="0"/>
               <w:jc w:val="start"/>
               <w:rPr>
@@ -3953,6 +4035,7 @@
             <w:pPr>
               <w:pStyle w:val="Normal"/>
               <w:widowControl/>
+              <w:suppressAutoHyphens w:val="true"/>
               <w:spacing w:lineRule="auto" w:line="240" w:before="0" w:after="0"/>
               <w:jc w:val="start"/>
               <w:rPr>
@@ -3985,6 +4068,7 @@
             <w:pPr>
               <w:pStyle w:val="Normal"/>
               <w:widowControl/>
+              <w:suppressAutoHyphens w:val="true"/>
               <w:spacing w:lineRule="auto" w:line="240" w:before="0" w:after="0"/>
               <w:jc w:val="start"/>
               <w:rPr>
@@ -4017,6 +4101,7 @@
             <w:pPr>
               <w:pStyle w:val="Normal"/>
               <w:widowControl/>
+              <w:suppressAutoHyphens w:val="true"/>
               <w:spacing w:lineRule="auto" w:line="240" w:before="0" w:after="0"/>
               <w:jc w:val="start"/>
               <w:rPr>
@@ -4052,6 +4137,7 @@
             <w:pPr>
               <w:pStyle w:val="Normal"/>
               <w:widowControl/>
+              <w:suppressAutoHyphens w:val="true"/>
               <w:spacing w:lineRule="auto" w:line="240" w:before="0" w:after="0"/>
               <w:jc w:val="start"/>
               <w:rPr>
@@ -4084,6 +4170,7 @@
             <w:pPr>
               <w:pStyle w:val="Normal"/>
               <w:widowControl/>
+              <w:suppressAutoHyphens w:val="true"/>
               <w:spacing w:lineRule="auto" w:line="240" w:before="0" w:after="0"/>
               <w:jc w:val="start"/>
               <w:rPr>
@@ -4116,6 +4203,7 @@
             <w:pPr>
               <w:pStyle w:val="Normal"/>
               <w:widowControl/>
+              <w:suppressAutoHyphens w:val="true"/>
               <w:spacing w:lineRule="auto" w:line="240" w:before="0" w:after="0"/>
               <w:jc w:val="start"/>
               <w:rPr>
@@ -4148,6 +4236,7 @@
             <w:pPr>
               <w:pStyle w:val="Normal"/>
               <w:widowControl/>
+              <w:suppressAutoHyphens w:val="true"/>
               <w:spacing w:lineRule="auto" w:line="240" w:before="0" w:after="0"/>
               <w:jc w:val="start"/>
               <w:rPr>
@@ -4183,6 +4272,7 @@
             <w:pPr>
               <w:pStyle w:val="Normal"/>
               <w:widowControl/>
+              <w:suppressAutoHyphens w:val="true"/>
               <w:spacing w:lineRule="auto" w:line="240" w:before="0" w:after="0"/>
               <w:jc w:val="start"/>
               <w:rPr>
@@ -4215,6 +4305,7 @@
             <w:pPr>
               <w:pStyle w:val="Normal"/>
               <w:widowControl/>
+              <w:suppressAutoHyphens w:val="true"/>
               <w:spacing w:lineRule="auto" w:line="240" w:before="0" w:after="0"/>
               <w:jc w:val="start"/>
               <w:rPr>
@@ -4247,6 +4338,7 @@
             <w:pPr>
               <w:pStyle w:val="Normal"/>
               <w:widowControl/>
+              <w:suppressAutoHyphens w:val="true"/>
               <w:spacing w:lineRule="auto" w:line="240" w:before="0" w:after="0"/>
               <w:jc w:val="start"/>
               <w:rPr>
@@ -4279,6 +4371,7 @@
             <w:pPr>
               <w:pStyle w:val="Normal"/>
               <w:widowControl/>
+              <w:suppressAutoHyphens w:val="true"/>
               <w:spacing w:lineRule="auto" w:line="240" w:before="0" w:after="0"/>
               <w:jc w:val="start"/>
               <w:rPr>
@@ -4314,6 +4407,7 @@
             <w:pPr>
               <w:pStyle w:val="Normal"/>
               <w:widowControl/>
+              <w:suppressAutoHyphens w:val="true"/>
               <w:spacing w:lineRule="auto" w:line="240" w:before="0" w:after="0"/>
               <w:jc w:val="start"/>
               <w:rPr>
@@ -4346,6 +4440,7 @@
             <w:pPr>
               <w:pStyle w:val="Normal"/>
               <w:widowControl/>
+              <w:suppressAutoHyphens w:val="true"/>
               <w:spacing w:lineRule="auto" w:line="240" w:before="0" w:after="0"/>
               <w:jc w:val="start"/>
               <w:rPr>
@@ -4378,6 +4473,7 @@
             <w:pPr>
               <w:pStyle w:val="Normal"/>
               <w:widowControl/>
+              <w:suppressAutoHyphens w:val="true"/>
               <w:spacing w:lineRule="auto" w:line="240" w:before="0" w:after="0"/>
               <w:jc w:val="start"/>
               <w:rPr>
@@ -4410,6 +4506,7 @@
             <w:pPr>
               <w:pStyle w:val="Normal"/>
               <w:widowControl/>
+              <w:suppressAutoHyphens w:val="true"/>
               <w:spacing w:lineRule="auto" w:line="240" w:before="0" w:after="0"/>
               <w:jc w:val="start"/>
               <w:rPr>
@@ -4445,6 +4542,7 @@
             <w:pPr>
               <w:pStyle w:val="Normal"/>
               <w:widowControl/>
+              <w:suppressAutoHyphens w:val="true"/>
               <w:spacing w:lineRule="auto" w:line="240" w:before="0" w:after="0"/>
               <w:jc w:val="start"/>
               <w:rPr>
@@ -4477,6 +4575,7 @@
             <w:pPr>
               <w:pStyle w:val="Normal"/>
               <w:widowControl/>
+              <w:suppressAutoHyphens w:val="true"/>
               <w:spacing w:lineRule="auto" w:line="240" w:before="0" w:after="0"/>
               <w:jc w:val="start"/>
               <w:rPr>
@@ -4509,6 +4608,7 @@
             <w:pPr>
               <w:pStyle w:val="Normal"/>
               <w:widowControl/>
+              <w:suppressAutoHyphens w:val="true"/>
               <w:spacing w:lineRule="auto" w:line="240" w:before="0" w:after="0"/>
               <w:jc w:val="start"/>
               <w:rPr>
@@ -4541,6 +4641,7 @@
             <w:pPr>
               <w:pStyle w:val="Normal"/>
               <w:widowControl/>
+              <w:suppressAutoHyphens w:val="true"/>
               <w:spacing w:lineRule="auto" w:line="240" w:before="0" w:after="0"/>
               <w:jc w:val="start"/>
               <w:rPr>
@@ -4576,6 +4677,7 @@
             <w:pPr>
               <w:pStyle w:val="Normal"/>
               <w:widowControl/>
+              <w:suppressAutoHyphens w:val="true"/>
               <w:spacing w:lineRule="auto" w:line="240" w:before="0" w:after="0"/>
               <w:jc w:val="start"/>
               <w:rPr>
@@ -4608,6 +4710,7 @@
             <w:pPr>
               <w:pStyle w:val="Normal"/>
               <w:widowControl/>
+              <w:suppressAutoHyphens w:val="true"/>
               <w:spacing w:lineRule="auto" w:line="240" w:before="0" w:after="0"/>
               <w:jc w:val="start"/>
               <w:rPr>
@@ -4640,6 +4743,7 @@
             <w:pPr>
               <w:pStyle w:val="Normal"/>
               <w:widowControl/>
+              <w:suppressAutoHyphens w:val="true"/>
               <w:spacing w:lineRule="auto" w:line="240" w:before="0" w:after="0"/>
               <w:jc w:val="start"/>
               <w:rPr>
@@ -4672,6 +4776,7 @@
             <w:pPr>
               <w:pStyle w:val="Normal"/>
               <w:widowControl/>
+              <w:suppressAutoHyphens w:val="true"/>
               <w:spacing w:lineRule="auto" w:line="240" w:before="0" w:after="0"/>
               <w:jc w:val="start"/>
               <w:rPr>
@@ -4707,6 +4812,7 @@
             <w:pPr>
               <w:pStyle w:val="Normal"/>
               <w:widowControl/>
+              <w:suppressAutoHyphens w:val="true"/>
               <w:spacing w:lineRule="auto" w:line="240" w:before="0" w:after="0"/>
               <w:jc w:val="start"/>
               <w:rPr>
@@ -4739,6 +4845,7 @@
             <w:pPr>
               <w:pStyle w:val="Normal"/>
               <w:widowControl/>
+              <w:suppressAutoHyphens w:val="true"/>
               <w:spacing w:lineRule="auto" w:line="240" w:before="0" w:after="0"/>
               <w:jc w:val="start"/>
               <w:rPr>
@@ -4771,6 +4878,7 @@
             <w:pPr>
               <w:pStyle w:val="Normal"/>
               <w:widowControl/>
+              <w:suppressAutoHyphens w:val="true"/>
               <w:spacing w:lineRule="auto" w:line="240" w:before="0" w:after="0"/>
               <w:jc w:val="start"/>
               <w:rPr>
@@ -4803,6 +4911,7 @@
             <w:pPr>
               <w:pStyle w:val="Normal"/>
               <w:widowControl/>
+              <w:suppressAutoHyphens w:val="true"/>
               <w:spacing w:lineRule="auto" w:line="240" w:before="0" w:after="0"/>
               <w:jc w:val="start"/>
               <w:rPr>
@@ -4838,6 +4947,7 @@
             <w:pPr>
               <w:pStyle w:val="Normal"/>
               <w:widowControl/>
+              <w:suppressAutoHyphens w:val="true"/>
               <w:spacing w:lineRule="auto" w:line="240" w:before="0" w:after="0"/>
               <w:jc w:val="start"/>
               <w:rPr>
@@ -4870,6 +4980,7 @@
             <w:pPr>
               <w:pStyle w:val="Normal"/>
               <w:widowControl/>
+              <w:suppressAutoHyphens w:val="true"/>
               <w:spacing w:lineRule="auto" w:line="240" w:before="0" w:after="0"/>
               <w:jc w:val="start"/>
               <w:rPr>
@@ -4902,6 +5013,7 @@
             <w:pPr>
               <w:pStyle w:val="Normal"/>
               <w:widowControl/>
+              <w:suppressAutoHyphens w:val="true"/>
               <w:spacing w:lineRule="auto" w:line="240" w:before="0" w:after="0"/>
               <w:jc w:val="start"/>
               <w:rPr>
@@ -4934,6 +5046,7 @@
             <w:pPr>
               <w:pStyle w:val="Normal"/>
               <w:widowControl/>
+              <w:suppressAutoHyphens w:val="true"/>
               <w:spacing w:lineRule="auto" w:line="240" w:before="0" w:after="0"/>
               <w:jc w:val="start"/>
               <w:rPr>
@@ -4969,6 +5082,7 @@
             <w:pPr>
               <w:pStyle w:val="Normal"/>
               <w:widowControl/>
+              <w:suppressAutoHyphens w:val="true"/>
               <w:spacing w:lineRule="auto" w:line="240" w:before="0" w:after="0"/>
               <w:jc w:val="start"/>
               <w:rPr>
@@ -5001,6 +5115,7 @@
             <w:pPr>
               <w:pStyle w:val="Normal"/>
               <w:widowControl/>
+              <w:suppressAutoHyphens w:val="true"/>
               <w:spacing w:lineRule="auto" w:line="240" w:before="0" w:after="0"/>
               <w:jc w:val="start"/>
               <w:rPr>
@@ -5033,6 +5148,7 @@
             <w:pPr>
               <w:pStyle w:val="Normal"/>
               <w:widowControl/>
+              <w:suppressAutoHyphens w:val="true"/>
               <w:spacing w:lineRule="auto" w:line="240" w:before="0" w:after="0"/>
               <w:jc w:val="start"/>
               <w:rPr>
@@ -5065,6 +5181,7 @@
             <w:pPr>
               <w:pStyle w:val="Normal"/>
               <w:widowControl/>
+              <w:suppressAutoHyphens w:val="true"/>
               <w:spacing w:lineRule="auto" w:line="240" w:before="0" w:after="0"/>
               <w:jc w:val="start"/>
               <w:rPr>
@@ -5100,6 +5217,7 @@
             <w:pPr>
               <w:pStyle w:val="Normal"/>
               <w:widowControl/>
+              <w:suppressAutoHyphens w:val="true"/>
               <w:spacing w:lineRule="auto" w:line="240" w:before="0" w:after="0"/>
               <w:jc w:val="start"/>
               <w:rPr>
@@ -5132,6 +5250,7 @@
             <w:pPr>
               <w:pStyle w:val="Normal"/>
               <w:widowControl/>
+              <w:suppressAutoHyphens w:val="true"/>
               <w:spacing w:lineRule="auto" w:line="240" w:before="0" w:after="0"/>
               <w:jc w:val="start"/>
               <w:rPr>
@@ -5164,6 +5283,7 @@
             <w:pPr>
               <w:pStyle w:val="Normal"/>
               <w:widowControl/>
+              <w:suppressAutoHyphens w:val="true"/>
               <w:spacing w:lineRule="auto" w:line="240" w:before="0" w:after="0"/>
               <w:jc w:val="start"/>
               <w:rPr>
@@ -5196,6 +5316,7 @@
             <w:pPr>
               <w:pStyle w:val="Normal"/>
               <w:widowControl/>
+              <w:suppressAutoHyphens w:val="true"/>
               <w:spacing w:lineRule="auto" w:line="240" w:before="0" w:after="0"/>
               <w:jc w:val="start"/>
               <w:rPr>
@@ -5231,6 +5352,7 @@
             <w:pPr>
               <w:pStyle w:val="Normal"/>
               <w:widowControl/>
+              <w:suppressAutoHyphens w:val="true"/>
               <w:spacing w:lineRule="auto" w:line="240" w:before="0" w:after="0"/>
               <w:jc w:val="start"/>
               <w:rPr>
@@ -5263,6 +5385,7 @@
             <w:pPr>
               <w:pStyle w:val="Normal"/>
               <w:widowControl/>
+              <w:suppressAutoHyphens w:val="true"/>
               <w:spacing w:lineRule="auto" w:line="240" w:before="0" w:after="0"/>
               <w:jc w:val="start"/>
               <w:rPr>
@@ -5295,6 +5418,7 @@
             <w:pPr>
               <w:pStyle w:val="Normal"/>
               <w:widowControl/>
+              <w:suppressAutoHyphens w:val="true"/>
               <w:spacing w:lineRule="auto" w:line="240" w:before="0" w:after="0"/>
               <w:jc w:val="start"/>
               <w:rPr>
@@ -5327,6 +5451,7 @@
             <w:pPr>
               <w:pStyle w:val="Normal"/>
               <w:widowControl/>
+              <w:suppressAutoHyphens w:val="true"/>
               <w:spacing w:lineRule="auto" w:line="240" w:before="0" w:after="0"/>
               <w:jc w:val="start"/>
               <w:rPr>
@@ -5426,6 +5551,7 @@
             <w:pPr>
               <w:pStyle w:val="Normal"/>
               <w:widowControl/>
+              <w:suppressAutoHyphens w:val="true"/>
               <w:spacing w:lineRule="auto" w:line="240" w:before="0" w:after="0"/>
               <w:jc w:val="start"/>
               <w:rPr>
@@ -5460,6 +5586,7 @@
             <w:pPr>
               <w:pStyle w:val="Normal"/>
               <w:widowControl/>
+              <w:suppressAutoHyphens w:val="true"/>
               <w:spacing w:lineRule="auto" w:line="240" w:before="0" w:after="0"/>
               <w:jc w:val="start"/>
               <w:rPr>
@@ -5494,6 +5621,7 @@
             <w:pPr>
               <w:pStyle w:val="Normal"/>
               <w:widowControl/>
+              <w:suppressAutoHyphens w:val="true"/>
               <w:spacing w:lineRule="auto" w:line="240" w:before="0" w:after="0"/>
               <w:jc w:val="start"/>
               <w:rPr>
@@ -5531,6 +5659,7 @@
             <w:pPr>
               <w:pStyle w:val="Normal"/>
               <w:widowControl/>
+              <w:suppressAutoHyphens w:val="true"/>
               <w:spacing w:lineRule="auto" w:line="240" w:before="0" w:after="0"/>
               <w:jc w:val="start"/>
               <w:rPr>
@@ -5563,6 +5692,7 @@
             <w:pPr>
               <w:pStyle w:val="Normal"/>
               <w:widowControl/>
+              <w:suppressAutoHyphens w:val="true"/>
               <w:spacing w:lineRule="auto" w:line="240" w:before="0" w:after="0"/>
               <w:jc w:val="start"/>
               <w:rPr>
@@ -5595,6 +5725,7 @@
             <w:pPr>
               <w:pStyle w:val="Normal"/>
               <w:widowControl/>
+              <w:suppressAutoHyphens w:val="true"/>
               <w:spacing w:lineRule="auto" w:line="240" w:before="0" w:after="0"/>
               <w:jc w:val="start"/>
               <w:rPr>
@@ -5630,6 +5761,7 @@
             <w:pPr>
               <w:pStyle w:val="Normal"/>
               <w:widowControl/>
+              <w:suppressAutoHyphens w:val="true"/>
               <w:spacing w:lineRule="auto" w:line="240" w:before="0" w:after="0"/>
               <w:jc w:val="start"/>
               <w:rPr>
@@ -5662,6 +5794,7 @@
             <w:pPr>
               <w:pStyle w:val="Normal"/>
               <w:widowControl/>
+              <w:suppressAutoHyphens w:val="true"/>
               <w:spacing w:lineRule="auto" w:line="240" w:before="0" w:after="0"/>
               <w:jc w:val="start"/>
               <w:rPr>
@@ -5694,6 +5827,7 @@
             <w:pPr>
               <w:pStyle w:val="Normal"/>
               <w:widowControl/>
+              <w:suppressAutoHyphens w:val="true"/>
               <w:spacing w:lineRule="auto" w:line="240" w:before="0" w:after="0"/>
               <w:jc w:val="start"/>
               <w:rPr>
@@ -5729,6 +5863,7 @@
             <w:pPr>
               <w:pStyle w:val="Normal"/>
               <w:widowControl/>
+              <w:suppressAutoHyphens w:val="true"/>
               <w:spacing w:lineRule="auto" w:line="240" w:before="0" w:after="0"/>
               <w:jc w:val="start"/>
               <w:rPr>
@@ -5761,6 +5896,7 @@
             <w:pPr>
               <w:pStyle w:val="Normal"/>
               <w:widowControl/>
+              <w:suppressAutoHyphens w:val="true"/>
               <w:spacing w:lineRule="auto" w:line="240" w:before="0" w:after="0"/>
               <w:jc w:val="start"/>
               <w:rPr>
@@ -5793,6 +5929,7 @@
             <w:pPr>
               <w:pStyle w:val="Normal"/>
               <w:widowControl/>
+              <w:suppressAutoHyphens w:val="true"/>
               <w:spacing w:lineRule="auto" w:line="240" w:before="0" w:after="0"/>
               <w:jc w:val="start"/>
               <w:rPr>
@@ -5828,6 +5965,7 @@
             <w:pPr>
               <w:pStyle w:val="Normal"/>
               <w:widowControl/>
+              <w:suppressAutoHyphens w:val="true"/>
               <w:spacing w:lineRule="auto" w:line="240" w:before="0" w:after="0"/>
               <w:jc w:val="start"/>
               <w:rPr>
@@ -5860,6 +5998,7 @@
             <w:pPr>
               <w:pStyle w:val="Normal"/>
               <w:widowControl/>
+              <w:suppressAutoHyphens w:val="true"/>
               <w:spacing w:lineRule="auto" w:line="240" w:before="0" w:after="0"/>
               <w:jc w:val="start"/>
               <w:rPr>
@@ -5892,6 +6031,7 @@
             <w:pPr>
               <w:pStyle w:val="Normal"/>
               <w:widowControl/>
+              <w:suppressAutoHyphens w:val="true"/>
               <w:spacing w:lineRule="auto" w:line="240" w:before="0" w:after="0"/>
               <w:jc w:val="start"/>
               <w:rPr>
@@ -5927,6 +6067,7 @@
             <w:pPr>
               <w:pStyle w:val="Normal"/>
               <w:widowControl/>
+              <w:suppressAutoHyphens w:val="true"/>
               <w:spacing w:lineRule="auto" w:line="240" w:before="0" w:after="0"/>
               <w:jc w:val="start"/>
               <w:rPr>
@@ -5959,6 +6100,7 @@
             <w:pPr>
               <w:pStyle w:val="Normal"/>
               <w:widowControl/>
+              <w:suppressAutoHyphens w:val="true"/>
               <w:spacing w:lineRule="auto" w:line="240" w:before="0" w:after="0"/>
               <w:jc w:val="start"/>
               <w:rPr>
@@ -5991,6 +6133,7 @@
             <w:pPr>
               <w:pStyle w:val="Normal"/>
               <w:widowControl/>
+              <w:suppressAutoHyphens w:val="true"/>
               <w:spacing w:lineRule="auto" w:line="240" w:before="0" w:after="0"/>
               <w:jc w:val="start"/>
               <w:rPr>
@@ -6026,6 +6169,7 @@
             <w:pPr>
               <w:pStyle w:val="Normal"/>
               <w:widowControl/>
+              <w:suppressAutoHyphens w:val="true"/>
               <w:spacing w:lineRule="auto" w:line="240" w:before="0" w:after="0"/>
               <w:jc w:val="start"/>
               <w:rPr>
@@ -6059,6 +6203,7 @@
             <w:pPr>
               <w:pStyle w:val="Normal"/>
               <w:widowControl/>
+              <w:suppressAutoHyphens w:val="true"/>
               <w:spacing w:lineRule="auto" w:line="240" w:before="0" w:after="0"/>
               <w:jc w:val="start"/>
               <w:rPr>
@@ -6092,6 +6237,7 @@
             <w:pPr>
               <w:pStyle w:val="Normal"/>
               <w:widowControl/>
+              <w:suppressAutoHyphens w:val="true"/>
               <w:spacing w:lineRule="auto" w:line="240" w:before="0" w:after="0"/>
               <w:jc w:val="start"/>
               <w:rPr>
@@ -6191,6 +6337,7 @@
             <w:pPr>
               <w:pStyle w:val="Normal"/>
               <w:widowControl/>
+              <w:suppressAutoHyphens w:val="true"/>
               <w:spacing w:lineRule="auto" w:line="240" w:before="0" w:after="0"/>
               <w:jc w:val="start"/>
               <w:rPr>
@@ -6223,6 +6370,7 @@
             <w:pPr>
               <w:pStyle w:val="Normal"/>
               <w:widowControl/>
+              <w:suppressAutoHyphens w:val="true"/>
               <w:spacing w:lineRule="auto" w:line="240" w:before="0" w:after="0"/>
               <w:jc w:val="start"/>
               <w:rPr>
@@ -6258,6 +6406,7 @@
             <w:pPr>
               <w:pStyle w:val="Normal"/>
               <w:widowControl/>
+              <w:suppressAutoHyphens w:val="true"/>
               <w:spacing w:lineRule="auto" w:line="240" w:before="0" w:after="0"/>
               <w:jc w:val="start"/>
               <w:rPr>
@@ -6288,6 +6437,7 @@
             <w:pPr>
               <w:pStyle w:val="Normal"/>
               <w:widowControl/>
+              <w:suppressAutoHyphens w:val="true"/>
               <w:spacing w:lineRule="auto" w:line="240" w:before="0" w:after="0"/>
               <w:jc w:val="start"/>
               <w:rPr>
@@ -6321,6 +6471,7 @@
             <w:pPr>
               <w:pStyle w:val="Normal"/>
               <w:widowControl/>
+              <w:suppressAutoHyphens w:val="true"/>
               <w:spacing w:lineRule="auto" w:line="240" w:before="0" w:after="0"/>
               <w:jc w:val="start"/>
               <w:rPr>
@@ -6351,6 +6502,7 @@
             <w:pPr>
               <w:pStyle w:val="Normal"/>
               <w:widowControl/>
+              <w:suppressAutoHyphens w:val="true"/>
               <w:spacing w:lineRule="auto" w:line="240" w:before="0" w:after="0"/>
               <w:jc w:val="start"/>
               <w:rPr>
@@ -6394,6 +6546,7 @@
             <w:pPr>
               <w:pStyle w:val="Normal"/>
               <w:widowControl/>
+              <w:suppressAutoHyphens w:val="true"/>
               <w:spacing w:lineRule="auto" w:line="240" w:before="0" w:after="0"/>
               <w:jc w:val="start"/>
               <w:rPr>
@@ -6424,6 +6577,7 @@
             <w:pPr>
               <w:pStyle w:val="Normal"/>
               <w:widowControl/>
+              <w:suppressAutoHyphens w:val="true"/>
               <w:spacing w:lineRule="auto" w:line="240" w:before="0" w:after="0"/>
               <w:jc w:val="start"/>
               <w:rPr>
@@ -6550,6 +6704,7 @@
             <w:pPr>
               <w:pStyle w:val="Normal"/>
               <w:widowControl/>
+              <w:suppressAutoHyphens w:val="true"/>
               <w:spacing w:lineRule="auto" w:line="240" w:before="0" w:after="0"/>
               <w:jc w:val="start"/>
               <w:rPr>
@@ -6584,6 +6739,7 @@
             <w:pPr>
               <w:pStyle w:val="Normal"/>
               <w:widowControl/>
+              <w:suppressAutoHyphens w:val="true"/>
               <w:spacing w:lineRule="auto" w:line="240" w:before="0" w:after="0"/>
               <w:jc w:val="start"/>
               <w:rPr>
@@ -6623,6 +6779,7 @@
             <w:pPr>
               <w:pStyle w:val="Normal"/>
               <w:widowControl/>
+              <w:suppressAutoHyphens w:val="true"/>
               <w:spacing w:lineRule="auto" w:line="240" w:before="0" w:after="0"/>
               <w:jc w:val="start"/>
               <w:rPr>
@@ -6655,6 +6812,7 @@
             <w:pPr>
               <w:pStyle w:val="Normal"/>
               <w:widowControl/>
+              <w:suppressAutoHyphens w:val="true"/>
               <w:spacing w:lineRule="auto" w:line="240" w:before="0" w:after="0"/>
               <w:jc w:val="start"/>
               <w:rPr>
@@ -6692,6 +6850,7 @@
             <w:pPr>
               <w:pStyle w:val="Normal"/>
               <w:widowControl/>
+              <w:suppressAutoHyphens w:val="true"/>
               <w:spacing w:lineRule="auto" w:line="240" w:before="0" w:after="0"/>
               <w:jc w:val="start"/>
               <w:rPr>
@@ -6724,6 +6883,7 @@
             <w:pPr>
               <w:pStyle w:val="Normal"/>
               <w:widowControl/>
+              <w:suppressAutoHyphens w:val="true"/>
               <w:spacing w:lineRule="auto" w:line="240" w:before="0" w:after="0"/>
               <w:jc w:val="start"/>
               <w:rPr>
@@ -6761,6 +6921,7 @@
             <w:pPr>
               <w:pStyle w:val="Normal"/>
               <w:widowControl/>
+              <w:suppressAutoHyphens w:val="true"/>
               <w:spacing w:lineRule="auto" w:line="240" w:before="0" w:after="0"/>
               <w:jc w:val="start"/>
               <w:rPr>
@@ -6793,6 +6954,7 @@
             <w:pPr>
               <w:pStyle w:val="Normal"/>
               <w:widowControl/>
+              <w:suppressAutoHyphens w:val="true"/>
               <w:spacing w:lineRule="auto" w:line="240" w:before="0" w:after="0"/>
               <w:jc w:val="start"/>
               <w:rPr>
@@ -6894,6 +7056,7 @@
             <w:pPr>
               <w:pStyle w:val="Normal"/>
               <w:widowControl/>
+              <w:suppressAutoHyphens w:val="true"/>
               <w:spacing w:lineRule="auto" w:line="240" w:before="0" w:after="0"/>
               <w:jc w:val="start"/>
               <w:rPr>
@@ -6928,6 +7091,7 @@
             <w:pPr>
               <w:pStyle w:val="Normal"/>
               <w:widowControl/>
+              <w:suppressAutoHyphens w:val="true"/>
               <w:spacing w:lineRule="auto" w:line="240" w:before="0" w:after="0"/>
               <w:jc w:val="start"/>
               <w:rPr>
@@ -6962,6 +7126,7 @@
             <w:pPr>
               <w:pStyle w:val="Normal"/>
               <w:widowControl/>
+              <w:suppressAutoHyphens w:val="true"/>
               <w:spacing w:lineRule="auto" w:line="240" w:before="0" w:after="0"/>
               <w:jc w:val="start"/>
               <w:rPr>
@@ -7001,6 +7166,7 @@
             <w:pPr>
               <w:pStyle w:val="Normal"/>
               <w:widowControl/>
+              <w:suppressAutoHyphens w:val="true"/>
               <w:spacing w:lineRule="auto" w:line="240" w:before="0" w:after="0"/>
               <w:jc w:val="start"/>
               <w:rPr>
@@ -7033,6 +7199,7 @@
             <w:pPr>
               <w:pStyle w:val="Normal"/>
               <w:widowControl/>
+              <w:suppressAutoHyphens w:val="true"/>
               <w:spacing w:lineRule="auto" w:line="240" w:before="0" w:after="0"/>
               <w:jc w:val="start"/>
               <w:rPr>
@@ -7065,6 +7232,7 @@
             <w:pPr>
               <w:pStyle w:val="Normal"/>
               <w:widowControl/>
+              <w:suppressAutoHyphens w:val="true"/>
               <w:spacing w:lineRule="auto" w:line="240" w:before="0" w:after="0"/>
               <w:jc w:val="start"/>
               <w:rPr>
@@ -7112,6 +7280,7 @@
             <w:pPr>
               <w:pStyle w:val="Normal"/>
               <w:widowControl/>
+              <w:suppressAutoHyphens w:val="true"/>
               <w:spacing w:lineRule="auto" w:line="240" w:before="0" w:after="0"/>
               <w:jc w:val="start"/>
               <w:rPr>
@@ -7144,6 +7313,7 @@
             <w:pPr>
               <w:pStyle w:val="Normal"/>
               <w:widowControl/>
+              <w:suppressAutoHyphens w:val="true"/>
               <w:spacing w:lineRule="auto" w:line="240" w:before="0" w:after="0"/>
               <w:jc w:val="start"/>
               <w:rPr>
@@ -7176,6 +7346,7 @@
             <w:pPr>
               <w:pStyle w:val="Normal"/>
               <w:widowControl/>
+              <w:suppressAutoHyphens w:val="true"/>
               <w:spacing w:lineRule="auto" w:line="240" w:before="0" w:after="0"/>
               <w:jc w:val="start"/>
               <w:rPr>
@@ -7223,6 +7394,7 @@
             <w:pPr>
               <w:pStyle w:val="Normal"/>
               <w:widowControl/>
+              <w:suppressAutoHyphens w:val="true"/>
               <w:spacing w:lineRule="auto" w:line="240" w:before="0" w:after="0"/>
               <w:jc w:val="start"/>
               <w:rPr>
@@ -7255,6 +7427,7 @@
             <w:pPr>
               <w:pStyle w:val="Normal"/>
               <w:widowControl/>
+              <w:suppressAutoHyphens w:val="true"/>
               <w:spacing w:lineRule="auto" w:line="240" w:before="0" w:after="0"/>
               <w:jc w:val="start"/>
               <w:rPr>
@@ -7287,6 +7460,7 @@
             <w:pPr>
               <w:pStyle w:val="Normal"/>
               <w:widowControl/>
+              <w:suppressAutoHyphens w:val="true"/>
               <w:spacing w:lineRule="auto" w:line="240" w:before="0" w:after="0"/>
               <w:jc w:val="start"/>
               <w:rPr>
@@ -7334,6 +7508,7 @@
             <w:pPr>
               <w:pStyle w:val="Normal"/>
               <w:widowControl/>
+              <w:suppressAutoHyphens w:val="true"/>
               <w:spacing w:lineRule="auto" w:line="240" w:before="0" w:after="0"/>
               <w:jc w:val="start"/>
               <w:rPr>
@@ -7367,6 +7542,7 @@
             <w:pPr>
               <w:pStyle w:val="Normal"/>
               <w:widowControl/>
+              <w:suppressAutoHyphens w:val="true"/>
               <w:spacing w:lineRule="auto" w:line="240" w:before="0" w:after="0"/>
               <w:jc w:val="start"/>
               <w:rPr>
@@ -7400,6 +7576,7 @@
             <w:pPr>
               <w:pStyle w:val="Normal"/>
               <w:widowControl/>
+              <w:suppressAutoHyphens w:val="true"/>
               <w:spacing w:lineRule="auto" w:line="240" w:before="0" w:after="0"/>
               <w:jc w:val="start"/>
               <w:rPr>
@@ -7512,6 +7689,7 @@
             <w:pPr>
               <w:pStyle w:val="Normal"/>
               <w:widowControl/>
+              <w:suppressAutoHyphens w:val="true"/>
               <w:spacing w:lineRule="auto" w:line="240" w:before="0" w:after="0"/>
               <w:jc w:val="start"/>
               <w:rPr>
@@ -7544,6 +7722,7 @@
             <w:pPr>
               <w:pStyle w:val="Normal"/>
               <w:widowControl/>
+              <w:suppressAutoHyphens w:val="true"/>
               <w:spacing w:lineRule="auto" w:line="240" w:before="0" w:after="0"/>
               <w:jc w:val="start"/>
               <w:rPr>
@@ -7581,6 +7760,7 @@
             <w:pPr>
               <w:pStyle w:val="Normal"/>
               <w:widowControl/>
+              <w:suppressAutoHyphens w:val="true"/>
               <w:spacing w:lineRule="auto" w:line="240" w:before="0" w:after="0"/>
               <w:jc w:val="start"/>
               <w:rPr>
@@ -7611,6 +7791,7 @@
             <w:pPr>
               <w:pStyle w:val="Normal"/>
               <w:widowControl/>
+              <w:suppressAutoHyphens w:val="true"/>
               <w:spacing w:lineRule="auto" w:line="240" w:before="0" w:after="0"/>
               <w:jc w:val="start"/>
               <w:rPr>
@@ -7656,6 +7837,7 @@
             <w:pPr>
               <w:pStyle w:val="Normal"/>
               <w:widowControl/>
+              <w:suppressAutoHyphens w:val="true"/>
               <w:spacing w:lineRule="auto" w:line="240" w:before="0" w:after="0"/>
               <w:jc w:val="start"/>
               <w:rPr>
@@ -7686,6 +7868,7 @@
             <w:pPr>
               <w:pStyle w:val="Normal"/>
               <w:widowControl/>
+              <w:suppressAutoHyphens w:val="true"/>
               <w:spacing w:lineRule="auto" w:line="240" w:before="0" w:after="0"/>
               <w:jc w:val="start"/>
               <w:rPr>
@@ -7731,6 +7914,7 @@
             <w:pPr>
               <w:pStyle w:val="Normal"/>
               <w:widowControl/>
+              <w:suppressAutoHyphens w:val="true"/>
               <w:spacing w:lineRule="auto" w:line="240" w:before="0" w:after="0"/>
               <w:jc w:val="start"/>
               <w:rPr>
@@ -7761,6 +7945,7 @@
             <w:pPr>
               <w:pStyle w:val="Normal"/>
               <w:widowControl/>
+              <w:suppressAutoHyphens w:val="true"/>
               <w:spacing w:lineRule="auto" w:line="240" w:before="0" w:after="0"/>
               <w:jc w:val="start"/>
               <w:rPr>
@@ -7806,6 +7991,7 @@
             <w:pPr>
               <w:pStyle w:val="Normal"/>
               <w:widowControl/>
+              <w:suppressAutoHyphens w:val="true"/>
               <w:spacing w:lineRule="auto" w:line="240" w:before="0" w:after="0"/>
               <w:jc w:val="start"/>
               <w:rPr>
@@ -7837,6 +8023,7 @@
             <w:pPr>
               <w:pStyle w:val="Normal"/>
               <w:widowControl/>
+              <w:suppressAutoHyphens w:val="true"/>
               <w:spacing w:lineRule="auto" w:line="240" w:before="0" w:after="0"/>
               <w:jc w:val="start"/>
               <w:rPr>
@@ -9028,6 +9215,7 @@
     <w:qFormat/>
     <w:pPr>
       <w:widowControl/>
+      <w:suppressAutoHyphens w:val="true"/>
       <w:bidi w:val="0"/>
       <w:spacing w:lineRule="auto" w:line="278" w:before="0" w:after="160"/>
       <w:jc w:val="start"/>

</xml_diff>